<commit_message>
feat: Add FYP Progress 1 Presentation, Architecture Diagram, and ERD Diagram
- Created a comprehensive presentation for FYP Progress 1 detailing project objectives, system architecture, core features, and current status.
- Added an architecture diagram using Mermaid to illustrate the system's backend services, execution flow, and task decomposition.
- Developed an ERD diagram in Mermaid format to represent the database schema, including entities like Organization, Device, Policy, and Execution Run with their relationships.
</commit_message>
<xml_diff>
--- a/Natural Language Policy Automation with Intelligent IoT Device Selection.docx
+++ b/Natural Language Policy Automation with Intelligent IoT Device Selection.docx
@@ -1032,6 +1032,13 @@
     </w:p>
     <w:sdt>
       <w:sdtPr>
+        <w:rPr>
+          <w:rFonts w:asciiTheme="minorHAnsi" w:eastAsiaTheme="minorHAnsi" w:hAnsiTheme="minorHAnsi" w:cstheme="minorBidi"/>
+          <w:b w:val="0"/>
+          <w:color w:val="auto"/>
+          <w:sz w:val="22"/>
+          <w:szCs w:val="22"/>
+        </w:rPr>
         <w:id w:val="-48229928"/>
         <w:docPartObj>
           <w:docPartGallery w:val="Table of Contents"/>
@@ -1040,12 +1047,8 @@
       </w:sdtPr>
       <w:sdtEndPr>
         <w:rPr>
-          <w:rFonts w:asciiTheme="minorHAnsi" w:eastAsiaTheme="minorHAnsi" w:hAnsiTheme="minorHAnsi" w:cstheme="minorBidi"/>
           <w:bCs/>
           <w:noProof/>
-          <w:color w:val="auto"/>
-          <w:sz w:val="22"/>
-          <w:szCs w:val="22"/>
         </w:rPr>
       </w:sdtEndPr>
       <w:sdtContent>
@@ -2126,7 +2129,23 @@
                 <w:noProof/>
                 <w:lang w:eastAsia="de-DE"/>
               </w:rPr>
-              <w:t xml:space="preserve"> Flow Chart</w:t>
+              <w:t xml:space="preserve"> Flow Ch</w:t>
+            </w:r>
+            <w:r>
+              <w:rPr>
+                <w:rStyle w:val="Hyperlink"/>
+                <w:noProof/>
+                <w:lang w:eastAsia="de-DE"/>
+              </w:rPr>
+              <w:t>a</w:t>
+            </w:r>
+            <w:r>
+              <w:rPr>
+                <w:rStyle w:val="Hyperlink"/>
+                <w:noProof/>
+                <w:lang w:eastAsia="de-DE"/>
+              </w:rPr>
+              <w:t>rt</w:t>
             </w:r>
             <w:r>
               <w:rPr>
@@ -3802,13 +3821,23 @@
           <w:szCs w:val="28"/>
         </w:rPr>
       </w:pPr>
-      <w:r>
-        <w:rPr>
-          <w:rFonts w:ascii="Arial" w:hAnsi="Arial" w:cs="Arial"/>
-          <w:sz w:val="28"/>
-          <w:szCs w:val="28"/>
-        </w:rPr>
-        <w:t>mplement a mechanism to intelligently identify and map the relevant IoT devices required for executing each policy without manual intervention.</w:t>
+      <w:proofErr w:type="spellStart"/>
+      <w:r>
+        <w:rPr>
+          <w:rFonts w:ascii="Arial" w:hAnsi="Arial" w:cs="Arial"/>
+          <w:sz w:val="28"/>
+          <w:szCs w:val="28"/>
+        </w:rPr>
+        <w:t>mplement</w:t>
+      </w:r>
+      <w:proofErr w:type="spellEnd"/>
+      <w:r>
+        <w:rPr>
+          <w:rFonts w:ascii="Arial" w:hAnsi="Arial" w:cs="Arial"/>
+          <w:sz w:val="28"/>
+          <w:szCs w:val="28"/>
+        </w:rPr>
+        <w:t xml:space="preserve"> a mechanism to intelligently identify and map the relevant IoT devices required for executing each policy without manual intervention.</w:t>
       </w:r>
     </w:p>
     <w:p>
@@ -4211,6 +4240,7 @@
         </w:rPr>
         <w:t xml:space="preserve">. For instance, </w:t>
       </w:r>
+      <w:proofErr w:type="spellStart"/>
       <w:r>
         <w:rPr>
           <w:rFonts w:ascii="Arial" w:hAnsi="Arial" w:cs="Arial"/>
@@ -4221,6 +4251,7 @@
         </w:rPr>
         <w:t>AutoIoT</w:t>
       </w:r>
+      <w:proofErr w:type="spellEnd"/>
       <w:r>
         <w:rPr>
           <w:rFonts w:ascii="Arial" w:hAnsi="Arial" w:cs="Arial"/>
@@ -4309,7 +4340,25 @@
           <w:szCs w:val="28"/>
         </w:rPr>
         <w:lastRenderedPageBreak/>
-        <w:t>occupancy detection, anomaly recognition, and activity monitoring (e.g., NVIDIA Metropolis and Intel OpenVINO toolkits). These systems are widely used for industrial surveillance and safety analytics but are not natively integrated with policy-driven IoT automation frameworks.</w:t>
+        <w:t xml:space="preserve">occupancy detection, anomaly recognition, and activity monitoring (e.g., NVIDIA Metropolis and Intel </w:t>
+      </w:r>
+      <w:proofErr w:type="spellStart"/>
+      <w:r>
+        <w:rPr>
+          <w:rFonts w:ascii="Arial" w:hAnsi="Arial" w:cs="Arial"/>
+          <w:sz w:val="28"/>
+          <w:szCs w:val="28"/>
+        </w:rPr>
+        <w:t>OpenVINO</w:t>
+      </w:r>
+      <w:proofErr w:type="spellEnd"/>
+      <w:r>
+        <w:rPr>
+          <w:rFonts w:ascii="Arial" w:hAnsi="Arial" w:cs="Arial"/>
+          <w:sz w:val="28"/>
+          <w:szCs w:val="28"/>
+        </w:rPr>
+        <w:t xml:space="preserve"> toolkits). These systems are widely used for industrial surveillance and safety analytics but are not natively integrated with policy-driven IoT automation frameworks.</w:t>
       </w:r>
     </w:p>
     <w:p>
@@ -5030,7 +5079,27 @@
           <w:szCs w:val="28"/>
           <w:lang w:eastAsia="de-DE"/>
         </w:rPr>
-        <w:t>The VLM returns results in structured format (e.g., person_detected=True).</w:t>
+        <w:t xml:space="preserve">The VLM returns results in structured format (e.g., </w:t>
+      </w:r>
+      <w:proofErr w:type="spellStart"/>
+      <w:r>
+        <w:rPr>
+          <w:rFonts w:ascii="Arial" w:hAnsi="Arial" w:cs="Arial"/>
+          <w:sz w:val="28"/>
+          <w:szCs w:val="28"/>
+          <w:lang w:eastAsia="de-DE"/>
+        </w:rPr>
+        <w:t>person_detected</w:t>
+      </w:r>
+      <w:proofErr w:type="spellEnd"/>
+      <w:r>
+        <w:rPr>
+          <w:rFonts w:ascii="Arial" w:hAnsi="Arial" w:cs="Arial"/>
+          <w:sz w:val="28"/>
+          <w:szCs w:val="28"/>
+          <w:lang w:eastAsia="de-DE"/>
+        </w:rPr>
+        <w:t>=True).</w:t>
       </w:r>
     </w:p>
     <w:p>
@@ -5113,7 +5182,27 @@
           <w:szCs w:val="28"/>
           <w:lang w:eastAsia="de-DE"/>
         </w:rPr>
-        <w:t>The executor sends commands to IoT devices in a standardized format (e.g., LOCK_DOOR(room=1)).</w:t>
+        <w:t>The executor sends commands to IoT devices in a standardized format (e.g., LOCK_</w:t>
+      </w:r>
+      <w:proofErr w:type="gramStart"/>
+      <w:r>
+        <w:rPr>
+          <w:rFonts w:ascii="Arial" w:hAnsi="Arial" w:cs="Arial"/>
+          <w:sz w:val="28"/>
+          <w:szCs w:val="28"/>
+          <w:lang w:eastAsia="de-DE"/>
+        </w:rPr>
+        <w:t>DOOR(</w:t>
+      </w:r>
+      <w:proofErr w:type="gramEnd"/>
+      <w:r>
+        <w:rPr>
+          <w:rFonts w:ascii="Arial" w:hAnsi="Arial" w:cs="Arial"/>
+          <w:sz w:val="28"/>
+          <w:szCs w:val="28"/>
+          <w:lang w:eastAsia="de-DE"/>
+        </w:rPr>
+        <w:t>room=1)).</w:t>
       </w:r>
     </w:p>
     <w:p>
@@ -5705,9 +5794,74 @@
       <w:bookmarkStart w:id="22" w:name="_Toc208367890"/>
       <w:r>
         <w:rPr>
+          <w:rFonts w:cs="Arial"/>
+          <w:b w:val="0"/>
+          <w:bCs/>
+          <w:noProof/>
+          <w:szCs w:val="28"/>
           <w:lang w:eastAsia="de-DE"/>
         </w:rPr>
         <w:lastRenderedPageBreak/>
+        <w:drawing>
+          <wp:anchor distT="0" distB="0" distL="114300" distR="114300" simplePos="0" relativeHeight="251661312" behindDoc="0" locked="0" layoutInCell="1" allowOverlap="1" wp14:anchorId="628FBE4C" wp14:editId="4449E360">
+            <wp:simplePos x="0" y="0"/>
+            <wp:positionH relativeFrom="column">
+              <wp:posOffset>-322331</wp:posOffset>
+            </wp:positionH>
+            <wp:positionV relativeFrom="paragraph">
+              <wp:posOffset>239257</wp:posOffset>
+            </wp:positionV>
+            <wp:extent cx="3143250" cy="8477885"/>
+            <wp:effectExtent l="0" t="0" r="0" b="0"/>
+            <wp:wrapNone/>
+            <wp:docPr id="1336038562" name="Picture 4"/>
+            <wp:cNvGraphicFramePr>
+              <a:graphicFrameLocks xmlns:a="http://schemas.openxmlformats.org/drawingml/2006/main" noChangeAspect="1"/>
+            </wp:cNvGraphicFramePr>
+            <a:graphic xmlns:a="http://schemas.openxmlformats.org/drawingml/2006/main">
+              <a:graphicData uri="http://schemas.openxmlformats.org/drawingml/2006/picture">
+                <pic:pic xmlns:pic="http://schemas.openxmlformats.org/drawingml/2006/picture">
+                  <pic:nvPicPr>
+                    <pic:cNvPr id="1336038562" name="Picture 1336038562"/>
+                    <pic:cNvPicPr/>
+                  </pic:nvPicPr>
+                  <pic:blipFill>
+                    <a:blip r:embed="rId9">
+                      <a:extLst>
+                        <a:ext uri="{28A0092B-C50C-407E-A947-70E740481C1C}">
+                          <a14:useLocalDpi xmlns:a14="http://schemas.microsoft.com/office/drawing/2010/main" val="0"/>
+                        </a:ext>
+                      </a:extLst>
+                    </a:blip>
+                    <a:stretch>
+                      <a:fillRect/>
+                    </a:stretch>
+                  </pic:blipFill>
+                  <pic:spPr>
+                    <a:xfrm>
+                      <a:off x="0" y="0"/>
+                      <a:ext cx="3143250" cy="8477885"/>
+                    </a:xfrm>
+                    <a:prstGeom prst="rect">
+                      <a:avLst/>
+                    </a:prstGeom>
+                  </pic:spPr>
+                </pic:pic>
+              </a:graphicData>
+            </a:graphic>
+            <wp14:sizeRelH relativeFrom="margin">
+              <wp14:pctWidth>0</wp14:pctWidth>
+            </wp14:sizeRelH>
+            <wp14:sizeRelV relativeFrom="margin">
+              <wp14:pctHeight>0</wp14:pctHeight>
+            </wp14:sizeRelV>
+          </wp:anchor>
+        </w:drawing>
+      </w:r>
+      <w:r>
+        <w:rPr>
+          <w:lang w:eastAsia="de-DE"/>
+        </w:rPr>
         <w:t>Block Diagram</w:t>
       </w:r>
       <w:r>
@@ -5754,7 +5908,7 @@
           <w:lang w:eastAsia="de-DE"/>
         </w:rPr>
         <w:drawing>
-          <wp:anchor distT="0" distB="0" distL="114300" distR="114300" simplePos="0" relativeHeight="251662336" behindDoc="0" locked="0" layoutInCell="1" allowOverlap="1" wp14:anchorId="3B2AB287" wp14:editId="499DCD40">
+          <wp:anchor distT="0" distB="0" distL="114300" distR="114300" simplePos="0" relativeHeight="251662336" behindDoc="0" locked="0" layoutInCell="1" allowOverlap="1" wp14:anchorId="3B2AB287" wp14:editId="03743017">
             <wp:simplePos x="0" y="0"/>
             <wp:positionH relativeFrom="column">
               <wp:posOffset>3416300</wp:posOffset>
@@ -5777,7 +5931,7 @@
                     <pic:cNvPicPr/>
                   </pic:nvPicPr>
                   <pic:blipFill>
-                    <a:blip r:embed="rId9">
+                    <a:blip r:embed="rId10">
                       <a:extLst>
                         <a:ext uri="{28A0092B-C50C-407E-A947-70E740481C1C}">
                           <a14:useLocalDpi xmlns:a14="http://schemas.microsoft.com/office/drawing/2010/main" val="0"/>
@@ -5812,72 +5966,6 @@
       <w:r>
         <w:rPr>
           <w:rFonts w:ascii="Arial" w:hAnsi="Arial" w:cs="Arial"/>
-          <w:b/>
-          <w:bCs/>
-          <w:noProof/>
-          <w:sz w:val="28"/>
-          <w:szCs w:val="28"/>
-          <w:lang w:eastAsia="de-DE"/>
-        </w:rPr>
-        <w:drawing>
-          <wp:anchor distT="0" distB="0" distL="114300" distR="114300" simplePos="0" relativeHeight="251661312" behindDoc="0" locked="0" layoutInCell="1" allowOverlap="1" wp14:anchorId="628FBE4C" wp14:editId="0933B674">
-            <wp:simplePos x="0" y="0"/>
-            <wp:positionH relativeFrom="column">
-              <wp:posOffset>-314325</wp:posOffset>
-            </wp:positionH>
-            <wp:positionV relativeFrom="paragraph">
-              <wp:posOffset>116205</wp:posOffset>
-            </wp:positionV>
-            <wp:extent cx="3143250" cy="8477885"/>
-            <wp:effectExtent l="0" t="0" r="0" b="0"/>
-            <wp:wrapNone/>
-            <wp:docPr id="1336038562" name="Picture 4"/>
-            <wp:cNvGraphicFramePr>
-              <a:graphicFrameLocks xmlns:a="http://schemas.openxmlformats.org/drawingml/2006/main" noChangeAspect="1"/>
-            </wp:cNvGraphicFramePr>
-            <a:graphic xmlns:a="http://schemas.openxmlformats.org/drawingml/2006/main">
-              <a:graphicData uri="http://schemas.openxmlformats.org/drawingml/2006/picture">
-                <pic:pic xmlns:pic="http://schemas.openxmlformats.org/drawingml/2006/picture">
-                  <pic:nvPicPr>
-                    <pic:cNvPr id="1336038562" name="Picture 1336038562"/>
-                    <pic:cNvPicPr/>
-                  </pic:nvPicPr>
-                  <pic:blipFill>
-                    <a:blip r:embed="rId10">
-                      <a:extLst>
-                        <a:ext uri="{28A0092B-C50C-407E-A947-70E740481C1C}">
-                          <a14:useLocalDpi xmlns:a14="http://schemas.microsoft.com/office/drawing/2010/main" val="0"/>
-                        </a:ext>
-                      </a:extLst>
-                    </a:blip>
-                    <a:stretch>
-                      <a:fillRect/>
-                    </a:stretch>
-                  </pic:blipFill>
-                  <pic:spPr>
-                    <a:xfrm>
-                      <a:off x="0" y="0"/>
-                      <a:ext cx="3143250" cy="8477885"/>
-                    </a:xfrm>
-                    <a:prstGeom prst="rect">
-                      <a:avLst/>
-                    </a:prstGeom>
-                  </pic:spPr>
-                </pic:pic>
-              </a:graphicData>
-            </a:graphic>
-            <wp14:sizeRelH relativeFrom="margin">
-              <wp14:pctWidth>0</wp14:pctWidth>
-            </wp14:sizeRelH>
-            <wp14:sizeRelV relativeFrom="margin">
-              <wp14:pctHeight>0</wp14:pctHeight>
-            </wp14:sizeRelV>
-          </wp:anchor>
-        </w:drawing>
-      </w:r>
-      <w:r>
-        <w:rPr>
-          <w:rFonts w:ascii="Arial" w:hAnsi="Arial" w:cs="Arial"/>
           <w:lang w:eastAsia="de-DE"/>
         </w:rPr>
         <w:br w:type="page"/>
@@ -9098,8 +9186,49 @@
           <w:szCs w:val="28"/>
           <w:lang w:eastAsia="de-DE"/>
         </w:rPr>
-        <w:t xml:space="preserve">[1] Yuyang Du, Qun Yang, Liujianfu Wang, Jingqi Lin, Hongwei Cui, Soung Chang Liew, “LLMind 2.0: Distributed IoT Automation with Natural Language M2M Communication and Lightweight LLM Agents,” </w:t>
-      </w:r>
+        <w:t xml:space="preserve">[1] Yuyang Du, Qun Yang, </w:t>
+      </w:r>
+      <w:proofErr w:type="spellStart"/>
+      <w:r>
+        <w:rPr>
+          <w:rFonts w:ascii="Arial" w:hAnsi="Arial" w:cs="Arial"/>
+          <w:sz w:val="28"/>
+          <w:szCs w:val="28"/>
+          <w:lang w:eastAsia="de-DE"/>
+        </w:rPr>
+        <w:t>Liujianfu</w:t>
+      </w:r>
+      <w:proofErr w:type="spellEnd"/>
+      <w:r>
+        <w:rPr>
+          <w:rFonts w:ascii="Arial" w:hAnsi="Arial" w:cs="Arial"/>
+          <w:sz w:val="28"/>
+          <w:szCs w:val="28"/>
+          <w:lang w:eastAsia="de-DE"/>
+        </w:rPr>
+        <w:t xml:space="preserve"> Wang, Jingqi Lin, Hongwei Cui, Soung Chang Liew, “</w:t>
+      </w:r>
+      <w:proofErr w:type="spellStart"/>
+      <w:r>
+        <w:rPr>
+          <w:rFonts w:ascii="Arial" w:hAnsi="Arial" w:cs="Arial"/>
+          <w:sz w:val="28"/>
+          <w:szCs w:val="28"/>
+          <w:lang w:eastAsia="de-DE"/>
+        </w:rPr>
+        <w:t>LLMind</w:t>
+      </w:r>
+      <w:proofErr w:type="spellEnd"/>
+      <w:r>
+        <w:rPr>
+          <w:rFonts w:ascii="Arial" w:hAnsi="Arial" w:cs="Arial"/>
+          <w:sz w:val="28"/>
+          <w:szCs w:val="28"/>
+          <w:lang w:eastAsia="de-DE"/>
+        </w:rPr>
+        <w:t xml:space="preserve"> 2.0: Distributed IoT Automation with Natural Language M2M Communication and Lightweight LLM Agents,” </w:t>
+      </w:r>
+      <w:proofErr w:type="spellStart"/>
       <w:r>
         <w:rPr>
           <w:rFonts w:ascii="Arial" w:hAnsi="Arial" w:cs="Arial"/>
@@ -9109,7 +9238,19 @@
           <w:szCs w:val="28"/>
           <w:lang w:eastAsia="de-DE"/>
         </w:rPr>
-        <w:t>arXiv preprint</w:t>
+        <w:t>arXiv</w:t>
+      </w:r>
+      <w:proofErr w:type="spellEnd"/>
+      <w:r>
+        <w:rPr>
+          <w:rFonts w:ascii="Arial" w:hAnsi="Arial" w:cs="Arial"/>
+          <w:i/>
+          <w:iCs/>
+          <w:sz w:val="28"/>
+          <w:szCs w:val="28"/>
+          <w:lang w:eastAsia="de-DE"/>
+        </w:rPr>
+        <w:t xml:space="preserve"> preprint</w:t>
       </w:r>
       <w:r>
         <w:rPr>
@@ -9121,6 +9262,7 @@
         <w:t xml:space="preserve">, August 2025. </w:t>
       </w:r>
       <w:hyperlink r:id="rId11" w:tgtFrame="_blank" w:history="1">
+        <w:proofErr w:type="spellStart"/>
         <w:r>
           <w:rPr>
             <w:rStyle w:val="Hyperlink"/>
@@ -9131,6 +9273,7 @@
           </w:rPr>
           <w:t>arXiv</w:t>
         </w:r>
+        <w:proofErr w:type="spellEnd"/>
       </w:hyperlink>
     </w:p>
     <w:p>
@@ -9150,8 +9293,69 @@
           <w:szCs w:val="28"/>
           <w:lang w:eastAsia="de-DE"/>
         </w:rPr>
-        <w:t xml:space="preserve">[2] Leming Shen, Qiang Yang, Yuanqing Zheng, Mo Li, “AutoIOT: LLM-Driven Automated Natural Language Programming for AIoT Applications,” </w:t>
-      </w:r>
+        <w:t xml:space="preserve">[2] Leming Shen, Qiang Yang, </w:t>
+      </w:r>
+      <w:proofErr w:type="spellStart"/>
+      <w:r>
+        <w:rPr>
+          <w:rFonts w:ascii="Arial" w:hAnsi="Arial" w:cs="Arial"/>
+          <w:sz w:val="28"/>
+          <w:szCs w:val="28"/>
+          <w:lang w:eastAsia="de-DE"/>
+        </w:rPr>
+        <w:t>Yuanqing</w:t>
+      </w:r>
+      <w:proofErr w:type="spellEnd"/>
+      <w:r>
+        <w:rPr>
+          <w:rFonts w:ascii="Arial" w:hAnsi="Arial" w:cs="Arial"/>
+          <w:sz w:val="28"/>
+          <w:szCs w:val="28"/>
+          <w:lang w:eastAsia="de-DE"/>
+        </w:rPr>
+        <w:t xml:space="preserve"> Zheng, Mo Li, “</w:t>
+      </w:r>
+      <w:proofErr w:type="spellStart"/>
+      <w:r>
+        <w:rPr>
+          <w:rFonts w:ascii="Arial" w:hAnsi="Arial" w:cs="Arial"/>
+          <w:sz w:val="28"/>
+          <w:szCs w:val="28"/>
+          <w:lang w:eastAsia="de-DE"/>
+        </w:rPr>
+        <w:t>AutoIOT</w:t>
+      </w:r>
+      <w:proofErr w:type="spellEnd"/>
+      <w:r>
+        <w:rPr>
+          <w:rFonts w:ascii="Arial" w:hAnsi="Arial" w:cs="Arial"/>
+          <w:sz w:val="28"/>
+          <w:szCs w:val="28"/>
+          <w:lang w:eastAsia="de-DE"/>
+        </w:rPr>
+        <w:t xml:space="preserve">: LLM-Driven Automated Natural Language Programming for </w:t>
+      </w:r>
+      <w:proofErr w:type="spellStart"/>
+      <w:r>
+        <w:rPr>
+          <w:rFonts w:ascii="Arial" w:hAnsi="Arial" w:cs="Arial"/>
+          <w:sz w:val="28"/>
+          <w:szCs w:val="28"/>
+          <w:lang w:eastAsia="de-DE"/>
+        </w:rPr>
+        <w:t>AIoT</w:t>
+      </w:r>
+      <w:proofErr w:type="spellEnd"/>
+      <w:r>
+        <w:rPr>
+          <w:rFonts w:ascii="Arial" w:hAnsi="Arial" w:cs="Arial"/>
+          <w:sz w:val="28"/>
+          <w:szCs w:val="28"/>
+          <w:lang w:eastAsia="de-DE"/>
+        </w:rPr>
+        <w:t xml:space="preserve"> Applications,” </w:t>
+      </w:r>
+      <w:proofErr w:type="spellStart"/>
       <w:r>
         <w:rPr>
           <w:rFonts w:ascii="Arial" w:hAnsi="Arial" w:cs="Arial"/>
@@ -9161,7 +9365,19 @@
           <w:szCs w:val="28"/>
           <w:lang w:eastAsia="de-DE"/>
         </w:rPr>
-        <w:t>arXiv preprint</w:t>
+        <w:t>arXiv</w:t>
+      </w:r>
+      <w:proofErr w:type="spellEnd"/>
+      <w:r>
+        <w:rPr>
+          <w:rFonts w:ascii="Arial" w:hAnsi="Arial" w:cs="Arial"/>
+          <w:i/>
+          <w:iCs/>
+          <w:sz w:val="28"/>
+          <w:szCs w:val="28"/>
+          <w:lang w:eastAsia="de-DE"/>
+        </w:rPr>
+        <w:t xml:space="preserve"> preprint</w:t>
       </w:r>
       <w:r>
         <w:rPr>
@@ -9173,6 +9389,7 @@
         <w:t xml:space="preserve">, March 2025. </w:t>
       </w:r>
       <w:hyperlink r:id="rId12" w:tgtFrame="_blank" w:history="1">
+        <w:proofErr w:type="spellStart"/>
         <w:r>
           <w:rPr>
             <w:rStyle w:val="Hyperlink"/>
@@ -9183,6 +9400,7 @@
           </w:rPr>
           <w:t>arXiv</w:t>
         </w:r>
+        <w:proofErr w:type="spellEnd"/>
       </w:hyperlink>
     </w:p>
     <w:p>
@@ -9203,8 +9421,49 @@
           <w:lang w:eastAsia="de-DE"/>
         </w:rPr>
         <w:lastRenderedPageBreak/>
-        <w:t xml:space="preserve">[3] Ye Cheng, Minghui Xu, Yue Zhang, Kun Li, Ruoxi Wang, Lian Yang, “AutoIoT: Automated IoT Platform Using Large Language Models,” </w:t>
-      </w:r>
+        <w:t xml:space="preserve">[3] Ye Cheng, </w:t>
+      </w:r>
+      <w:proofErr w:type="spellStart"/>
+      <w:r>
+        <w:rPr>
+          <w:rFonts w:ascii="Arial" w:hAnsi="Arial" w:cs="Arial"/>
+          <w:sz w:val="28"/>
+          <w:szCs w:val="28"/>
+          <w:lang w:eastAsia="de-DE"/>
+        </w:rPr>
+        <w:t>Minghui</w:t>
+      </w:r>
+      <w:proofErr w:type="spellEnd"/>
+      <w:r>
+        <w:rPr>
+          <w:rFonts w:ascii="Arial" w:hAnsi="Arial" w:cs="Arial"/>
+          <w:sz w:val="28"/>
+          <w:szCs w:val="28"/>
+          <w:lang w:eastAsia="de-DE"/>
+        </w:rPr>
+        <w:t xml:space="preserve"> Xu, Yue Zhang, Kun Li, Ruoxi Wang, Lian Yang, “</w:t>
+      </w:r>
+      <w:proofErr w:type="spellStart"/>
+      <w:r>
+        <w:rPr>
+          <w:rFonts w:ascii="Arial" w:hAnsi="Arial" w:cs="Arial"/>
+          <w:sz w:val="28"/>
+          <w:szCs w:val="28"/>
+          <w:lang w:eastAsia="de-DE"/>
+        </w:rPr>
+        <w:t>AutoIoT</w:t>
+      </w:r>
+      <w:proofErr w:type="spellEnd"/>
+      <w:r>
+        <w:rPr>
+          <w:rFonts w:ascii="Arial" w:hAnsi="Arial" w:cs="Arial"/>
+          <w:sz w:val="28"/>
+          <w:szCs w:val="28"/>
+          <w:lang w:eastAsia="de-DE"/>
+        </w:rPr>
+        <w:t xml:space="preserve">: Automated IoT Platform Using Large Language Models,” </w:t>
+      </w:r>
+      <w:proofErr w:type="spellStart"/>
       <w:r>
         <w:rPr>
           <w:rFonts w:ascii="Arial" w:hAnsi="Arial" w:cs="Arial"/>
@@ -9214,7 +9473,19 @@
           <w:szCs w:val="28"/>
           <w:lang w:eastAsia="de-DE"/>
         </w:rPr>
-        <w:t>arXiv preprint</w:t>
+        <w:t>arXiv</w:t>
+      </w:r>
+      <w:proofErr w:type="spellEnd"/>
+      <w:r>
+        <w:rPr>
+          <w:rFonts w:ascii="Arial" w:hAnsi="Arial" w:cs="Arial"/>
+          <w:i/>
+          <w:iCs/>
+          <w:sz w:val="28"/>
+          <w:szCs w:val="28"/>
+          <w:lang w:eastAsia="de-DE"/>
+        </w:rPr>
+        <w:t xml:space="preserve"> preprint</w:t>
       </w:r>
       <w:r>
         <w:rPr>
@@ -9226,6 +9497,7 @@
         <w:t xml:space="preserve">, November 2024. </w:t>
       </w:r>
       <w:hyperlink r:id="rId13" w:tgtFrame="_blank" w:history="1">
+        <w:proofErr w:type="spellStart"/>
         <w:r>
           <w:rPr>
             <w:rStyle w:val="Hyperlink"/>
@@ -9236,6 +9508,7 @@
           </w:rPr>
           <w:t>arXiv</w:t>
         </w:r>
+        <w:proofErr w:type="spellEnd"/>
       </w:hyperlink>
     </w:p>
     <w:p>
@@ -9278,6 +9551,7 @@
         <w:t xml:space="preserve"> (MDPI), 2025. </w:t>
       </w:r>
       <w:hyperlink r:id="rId14" w:tgtFrame="_blank" w:history="1">
+        <w:proofErr w:type="spellStart"/>
         <w:r>
           <w:rPr>
             <w:rStyle w:val="Hyperlink"/>
@@ -9300,6 +9574,7 @@
           </w:rPr>
           <w:t>PubMed</w:t>
         </w:r>
+        <w:proofErr w:type="spellEnd"/>
       </w:hyperlink>
     </w:p>
     <w:p>
@@ -9319,7 +9594,127 @@
           <w:szCs w:val="28"/>
           <w:lang w:eastAsia="de-DE"/>
         </w:rPr>
-        <w:t>[5] Ye Cheng, Minghui Xu, Yue Zhang, Kun Li, Hao Wu, Yechao Zhang, Shaoyong Guo, Wangjie Qiu, Dongxiao Yu, Xiuzhen Cheng, “Say What You Mean: Natural Language Access Control with Large Language Models for Internet of Things (</w:t>
+        <w:t xml:space="preserve">[5] Ye Cheng, </w:t>
+      </w:r>
+      <w:proofErr w:type="spellStart"/>
+      <w:r>
+        <w:rPr>
+          <w:rFonts w:ascii="Arial" w:hAnsi="Arial" w:cs="Arial"/>
+          <w:sz w:val="28"/>
+          <w:szCs w:val="28"/>
+          <w:lang w:eastAsia="de-DE"/>
+        </w:rPr>
+        <w:t>Minghui</w:t>
+      </w:r>
+      <w:proofErr w:type="spellEnd"/>
+      <w:r>
+        <w:rPr>
+          <w:rFonts w:ascii="Arial" w:hAnsi="Arial" w:cs="Arial"/>
+          <w:sz w:val="28"/>
+          <w:szCs w:val="28"/>
+          <w:lang w:eastAsia="de-DE"/>
+        </w:rPr>
+        <w:t xml:space="preserve"> Xu, Yue Zhang, Kun Li, Hao Wu, </w:t>
+      </w:r>
+      <w:proofErr w:type="spellStart"/>
+      <w:r>
+        <w:rPr>
+          <w:rFonts w:ascii="Arial" w:hAnsi="Arial" w:cs="Arial"/>
+          <w:sz w:val="28"/>
+          <w:szCs w:val="28"/>
+          <w:lang w:eastAsia="de-DE"/>
+        </w:rPr>
+        <w:t>Yechao</w:t>
+      </w:r>
+      <w:proofErr w:type="spellEnd"/>
+      <w:r>
+        <w:rPr>
+          <w:rFonts w:ascii="Arial" w:hAnsi="Arial" w:cs="Arial"/>
+          <w:sz w:val="28"/>
+          <w:szCs w:val="28"/>
+          <w:lang w:eastAsia="de-DE"/>
+        </w:rPr>
+        <w:t xml:space="preserve"> Zhang, </w:t>
+      </w:r>
+      <w:proofErr w:type="spellStart"/>
+      <w:r>
+        <w:rPr>
+          <w:rFonts w:ascii="Arial" w:hAnsi="Arial" w:cs="Arial"/>
+          <w:sz w:val="28"/>
+          <w:szCs w:val="28"/>
+          <w:lang w:eastAsia="de-DE"/>
+        </w:rPr>
+        <w:t>Shaoyong</w:t>
+      </w:r>
+      <w:proofErr w:type="spellEnd"/>
+      <w:r>
+        <w:rPr>
+          <w:rFonts w:ascii="Arial" w:hAnsi="Arial" w:cs="Arial"/>
+          <w:sz w:val="28"/>
+          <w:szCs w:val="28"/>
+          <w:lang w:eastAsia="de-DE"/>
+        </w:rPr>
+        <w:t xml:space="preserve"> Guo, </w:t>
+      </w:r>
+      <w:proofErr w:type="spellStart"/>
+      <w:r>
+        <w:rPr>
+          <w:rFonts w:ascii="Arial" w:hAnsi="Arial" w:cs="Arial"/>
+          <w:sz w:val="28"/>
+          <w:szCs w:val="28"/>
+          <w:lang w:eastAsia="de-DE"/>
+        </w:rPr>
+        <w:t>Wangjie</w:t>
+      </w:r>
+      <w:proofErr w:type="spellEnd"/>
+      <w:r>
+        <w:rPr>
+          <w:rFonts w:ascii="Arial" w:hAnsi="Arial" w:cs="Arial"/>
+          <w:sz w:val="28"/>
+          <w:szCs w:val="28"/>
+          <w:lang w:eastAsia="de-DE"/>
+        </w:rPr>
+        <w:t xml:space="preserve"> Qiu, </w:t>
+      </w:r>
+      <w:proofErr w:type="spellStart"/>
+      <w:r>
+        <w:rPr>
+          <w:rFonts w:ascii="Arial" w:hAnsi="Arial" w:cs="Arial"/>
+          <w:sz w:val="28"/>
+          <w:szCs w:val="28"/>
+          <w:lang w:eastAsia="de-DE"/>
+        </w:rPr>
+        <w:t>Dongxiao</w:t>
+      </w:r>
+      <w:proofErr w:type="spellEnd"/>
+      <w:r>
+        <w:rPr>
+          <w:rFonts w:ascii="Arial" w:hAnsi="Arial" w:cs="Arial"/>
+          <w:sz w:val="28"/>
+          <w:szCs w:val="28"/>
+          <w:lang w:eastAsia="de-DE"/>
+        </w:rPr>
+        <w:t xml:space="preserve"> Yu, </w:t>
+      </w:r>
+      <w:proofErr w:type="spellStart"/>
+      <w:r>
+        <w:rPr>
+          <w:rFonts w:ascii="Arial" w:hAnsi="Arial" w:cs="Arial"/>
+          <w:sz w:val="28"/>
+          <w:szCs w:val="28"/>
+          <w:lang w:eastAsia="de-DE"/>
+        </w:rPr>
+        <w:t>Xiuzhen</w:t>
+      </w:r>
+      <w:proofErr w:type="spellEnd"/>
+      <w:r>
+        <w:rPr>
+          <w:rFonts w:ascii="Arial" w:hAnsi="Arial" w:cs="Arial"/>
+          <w:sz w:val="28"/>
+          <w:szCs w:val="28"/>
+          <w:lang w:eastAsia="de-DE"/>
+        </w:rPr>
+        <w:t xml:space="preserve"> Cheng, “Say What You Mean: Natural Language Access Control with Large Language Models for Internet of Things (</w:t>
       </w:r>
       <w:r>
         <w:rPr>
@@ -9341,6 +9736,7 @@
         </w:rPr>
         <w:t xml:space="preserve">),” </w:t>
       </w:r>
+      <w:proofErr w:type="spellStart"/>
       <w:r>
         <w:rPr>
           <w:rFonts w:ascii="Arial" w:hAnsi="Arial" w:cs="Arial"/>
@@ -9350,7 +9746,19 @@
           <w:szCs w:val="28"/>
           <w:lang w:eastAsia="de-DE"/>
         </w:rPr>
-        <w:t>arXiv preprint</w:t>
+        <w:t>arXiv</w:t>
+      </w:r>
+      <w:proofErr w:type="spellEnd"/>
+      <w:r>
+        <w:rPr>
+          <w:rFonts w:ascii="Arial" w:hAnsi="Arial" w:cs="Arial"/>
+          <w:i/>
+          <w:iCs/>
+          <w:sz w:val="28"/>
+          <w:szCs w:val="28"/>
+          <w:lang w:eastAsia="de-DE"/>
+        </w:rPr>
+        <w:t xml:space="preserve"> preprint</w:t>
       </w:r>
       <w:r>
         <w:rPr>
@@ -10408,6 +10816,7 @@
                 <w:szCs w:val="24"/>
                 <w:lang w:eastAsia="de-DE"/>
               </w:rPr>
+              <w:lastRenderedPageBreak/>
               <w:t>7</w:t>
             </w:r>
           </w:p>
@@ -10988,18 +11397,7 @@
                 <w:szCs w:val="24"/>
                 <w:lang w:eastAsia="de-DE"/>
               </w:rPr>
-              <w:t xml:space="preserve">Goal </w:t>
-            </w:r>
-            <w:r>
-              <w:rPr>
-                <w:rFonts w:ascii="Arial" w:eastAsia="Times New Roman" w:hAnsi="Arial" w:cs="Arial"/>
-                <w:b/>
-                <w:bCs/>
-                <w:sz w:val="24"/>
-                <w:szCs w:val="24"/>
-                <w:lang w:eastAsia="de-DE"/>
-              </w:rPr>
-              <w:t>1</w:t>
+              <w:t>Goal 1</w:t>
             </w:r>
           </w:p>
         </w:tc>
@@ -11101,18 +11499,7 @@
                 <w:szCs w:val="24"/>
                 <w:lang w:eastAsia="de-DE"/>
               </w:rPr>
-              <w:t xml:space="preserve">Goal </w:t>
-            </w:r>
-            <w:r>
-              <w:rPr>
-                <w:rFonts w:ascii="Arial" w:eastAsia="Times New Roman" w:hAnsi="Arial" w:cs="Arial"/>
-                <w:b/>
-                <w:bCs/>
-                <w:sz w:val="24"/>
-                <w:szCs w:val="24"/>
-                <w:lang w:eastAsia="de-DE"/>
-              </w:rPr>
-              <w:t>2</w:t>
+              <w:t>Goal 2</w:t>
             </w:r>
           </w:p>
         </w:tc>
@@ -11214,18 +11601,7 @@
                 <w:szCs w:val="24"/>
                 <w:lang w:eastAsia="de-DE"/>
               </w:rPr>
-              <w:t xml:space="preserve">Goal </w:t>
-            </w:r>
-            <w:r>
-              <w:rPr>
-                <w:rFonts w:ascii="Arial" w:eastAsia="Times New Roman" w:hAnsi="Arial" w:cs="Arial"/>
-                <w:b/>
-                <w:bCs/>
-                <w:sz w:val="24"/>
-                <w:szCs w:val="24"/>
-                <w:lang w:eastAsia="de-DE"/>
-              </w:rPr>
-              <w:t>3</w:t>
+              <w:t>Goal 3</w:t>
             </w:r>
           </w:p>
         </w:tc>
@@ -11327,18 +11703,7 @@
                 <w:szCs w:val="24"/>
                 <w:lang w:eastAsia="de-DE"/>
               </w:rPr>
-              <w:t xml:space="preserve">Goal </w:t>
-            </w:r>
-            <w:r>
-              <w:rPr>
-                <w:rFonts w:ascii="Arial" w:eastAsia="Times New Roman" w:hAnsi="Arial" w:cs="Arial"/>
-                <w:b/>
-                <w:bCs/>
-                <w:sz w:val="24"/>
-                <w:szCs w:val="24"/>
-                <w:lang w:eastAsia="de-DE"/>
-              </w:rPr>
-              <w:t>4</w:t>
+              <w:t>Goal 4</w:t>
             </w:r>
           </w:p>
         </w:tc>
@@ -11440,18 +11805,7 @@
                 <w:szCs w:val="24"/>
                 <w:lang w:eastAsia="de-DE"/>
               </w:rPr>
-              <w:t xml:space="preserve">Goal </w:t>
-            </w:r>
-            <w:r>
-              <w:rPr>
-                <w:rFonts w:ascii="Arial" w:eastAsia="Times New Roman" w:hAnsi="Arial" w:cs="Arial"/>
-                <w:b/>
-                <w:bCs/>
-                <w:sz w:val="24"/>
-                <w:szCs w:val="24"/>
-                <w:lang w:eastAsia="de-DE"/>
-              </w:rPr>
-              <w:t>5</w:t>
+              <w:t>Goal 5</w:t>
             </w:r>
           </w:p>
         </w:tc>
@@ -11553,18 +11907,7 @@
                 <w:szCs w:val="24"/>
                 <w:lang w:eastAsia="de-DE"/>
               </w:rPr>
-              <w:t xml:space="preserve">Goal </w:t>
-            </w:r>
-            <w:r>
-              <w:rPr>
-                <w:rFonts w:ascii="Arial" w:eastAsia="Times New Roman" w:hAnsi="Arial" w:cs="Arial"/>
-                <w:b/>
-                <w:bCs/>
-                <w:sz w:val="24"/>
-                <w:szCs w:val="24"/>
-                <w:lang w:eastAsia="de-DE"/>
-              </w:rPr>
-              <w:t>6</w:t>
+              <w:t>Goal 6</w:t>
             </w:r>
           </w:p>
         </w:tc>
@@ -11666,18 +12009,7 @@
                 <w:szCs w:val="24"/>
                 <w:lang w:eastAsia="de-DE"/>
               </w:rPr>
-              <w:t xml:space="preserve">Goal </w:t>
-            </w:r>
-            <w:r>
-              <w:rPr>
-                <w:rFonts w:ascii="Arial" w:eastAsia="Times New Roman" w:hAnsi="Arial" w:cs="Arial"/>
-                <w:b/>
-                <w:bCs/>
-                <w:sz w:val="24"/>
-                <w:szCs w:val="24"/>
-                <w:lang w:eastAsia="de-DE"/>
-              </w:rPr>
-              <w:t>7</w:t>
+              <w:t>Goal 7</w:t>
             </w:r>
           </w:p>
         </w:tc>
@@ -12150,24 +12482,7 @@
           <w:lang w:eastAsia="de-DE"/>
         </w:rPr>
         <w:tab/>
-      </w:r>
-      <w:r>
-        <w:rPr>
-          <w:rFonts w:ascii="Arial" w:eastAsia="Times New Roman" w:hAnsi="Arial" w:cs="Arial"/>
-          <w:sz w:val="24"/>
-          <w:szCs w:val="24"/>
-          <w:lang w:eastAsia="de-DE"/>
-        </w:rPr>
-        <w:t>Tayyab Ahmad</w:t>
-      </w:r>
-      <w:r>
-        <w:rPr>
-          <w:rFonts w:ascii="Arial" w:eastAsia="Times New Roman" w:hAnsi="Arial" w:cs="Arial"/>
-          <w:sz w:val="24"/>
-          <w:szCs w:val="24"/>
-          <w:lang w:eastAsia="de-DE"/>
-        </w:rPr>
-        <w:t xml:space="preserve"> (22MDSWE217)</w:t>
+        <w:t>Tayyab Ahmad (22MDSWE217)</w:t>
       </w:r>
     </w:p>
     <w:p>
@@ -15460,6 +15775,7 @@
   <w:style w:type="character" w:default="1" w:styleId="DefaultParagraphFont">
     <w:name w:val="Default Paragraph Font"/>
     <w:uiPriority w:val="1"/>
+    <w:semiHidden/>
     <w:unhideWhenUsed/>
   </w:style>
   <w:style w:type="table" w:default="1" w:styleId="TableNormal">

</xml_diff>